<commit_message>
Added comparison by training the dataset on more custom stopwords - Performance Degraded
</commit_message>
<xml_diff>
--- a/Comparison/Comparison.docx
+++ b/Comparison/Comparison.docx
@@ -2320,6 +2320,1161 @@
         </w:rPr>
         <w:t xml:space="preserve"> = {"dear", "thanks", "thank", "regards", "kind", "hello", "hi", "please", "good", "morning", "afternoon", "evening"}</w:t>
       </w:r>
+    </w:p>
+    <w:p>
+      <w:pPr>
+        <w:pStyle w:val="ListParagraph"/>
+        <w:spacing w:after="0"/>
+        <w:ind w:left="357"/>
+        <w:rPr>
+          <w:rStyle w:val="BookTitle"/>
+          <w:b w:val="0"/>
+          <w:bCs w:val="0"/>
+          <w:i w:val="0"/>
+          <w:iCs w:val="0"/>
+          <w:lang w:val="en-US"/>
+        </w:rPr>
+      </w:pPr>
+    </w:p>
+    <w:tbl>
+      <w:tblPr>
+        <w:tblStyle w:val="TableGrid"/>
+        <w:tblW w:w="0" w:type="auto"/>
+        <w:tblInd w:w="357" w:type="dxa"/>
+        <w:tblLook w:val="04A0" w:firstRow="1" w:lastRow="0" w:firstColumn="1" w:lastColumn="0" w:noHBand="0" w:noVBand="1"/>
+      </w:tblPr>
+      <w:tblGrid>
+        <w:gridCol w:w="1731"/>
+        <w:gridCol w:w="1731"/>
+        <w:gridCol w:w="1732"/>
+        <w:gridCol w:w="1732"/>
+      </w:tblGrid>
+      <w:tr>
+        <w:tc>
+          <w:tcPr>
+            <w:tcW w:w="1731" w:type="dxa"/>
+          </w:tcPr>
+          <w:p>
+            <w:pPr>
+              <w:pStyle w:val="ListParagraph"/>
+              <w:ind w:left="0"/>
+              <w:rPr>
+                <w:rStyle w:val="BookTitle"/>
+                <w:b w:val="0"/>
+                <w:bCs w:val="0"/>
+                <w:i w:val="0"/>
+                <w:iCs w:val="0"/>
+                <w:lang w:val="en-US"/>
+              </w:rPr>
+            </w:pPr>
+            <w:r>
+              <w:rPr>
+                <w:rStyle w:val="BookTitle"/>
+                <w:b w:val="0"/>
+                <w:bCs w:val="0"/>
+                <w:i w:val="0"/>
+                <w:iCs w:val="0"/>
+                <w:lang w:val="en-US"/>
+              </w:rPr>
+              <w:t>Topic Group</w:t>
+            </w:r>
+          </w:p>
+        </w:tc>
+        <w:tc>
+          <w:tcPr>
+            <w:tcW w:w="1731" w:type="dxa"/>
+          </w:tcPr>
+          <w:p>
+            <w:pPr>
+              <w:pStyle w:val="ListParagraph"/>
+              <w:ind w:left="0"/>
+              <w:rPr>
+                <w:rStyle w:val="BookTitle"/>
+                <w:b w:val="0"/>
+                <w:bCs w:val="0"/>
+                <w:i w:val="0"/>
+                <w:iCs w:val="0"/>
+                <w:lang w:val="en-US"/>
+              </w:rPr>
+            </w:pPr>
+            <w:r>
+              <w:rPr>
+                <w:rStyle w:val="BookTitle"/>
+                <w:b w:val="0"/>
+                <w:bCs w:val="0"/>
+                <w:i w:val="0"/>
+                <w:iCs w:val="0"/>
+                <w:lang w:val="en-US"/>
+              </w:rPr>
+              <w:t>Precision</w:t>
+            </w:r>
+          </w:p>
+        </w:tc>
+        <w:tc>
+          <w:tcPr>
+            <w:tcW w:w="1732" w:type="dxa"/>
+          </w:tcPr>
+          <w:p>
+            <w:pPr>
+              <w:pStyle w:val="ListParagraph"/>
+              <w:ind w:left="0"/>
+              <w:rPr>
+                <w:rStyle w:val="BookTitle"/>
+                <w:b w:val="0"/>
+                <w:bCs w:val="0"/>
+                <w:i w:val="0"/>
+                <w:iCs w:val="0"/>
+                <w:lang w:val="en-US"/>
+              </w:rPr>
+            </w:pPr>
+            <w:r>
+              <w:rPr>
+                <w:rStyle w:val="BookTitle"/>
+                <w:b w:val="0"/>
+                <w:bCs w:val="0"/>
+                <w:i w:val="0"/>
+                <w:iCs w:val="0"/>
+                <w:lang w:val="en-US"/>
+              </w:rPr>
+              <w:t>Recall</w:t>
+            </w:r>
+          </w:p>
+        </w:tc>
+        <w:tc>
+          <w:tcPr>
+            <w:tcW w:w="1732" w:type="dxa"/>
+          </w:tcPr>
+          <w:p>
+            <w:pPr>
+              <w:pStyle w:val="ListParagraph"/>
+              <w:ind w:left="0"/>
+              <w:rPr>
+                <w:rStyle w:val="BookTitle"/>
+                <w:b w:val="0"/>
+                <w:bCs w:val="0"/>
+                <w:i w:val="0"/>
+                <w:iCs w:val="0"/>
+                <w:lang w:val="en-US"/>
+              </w:rPr>
+            </w:pPr>
+            <w:r>
+              <w:rPr>
+                <w:rStyle w:val="BookTitle"/>
+                <w:b w:val="0"/>
+                <w:bCs w:val="0"/>
+                <w:i w:val="0"/>
+                <w:iCs w:val="0"/>
+                <w:lang w:val="en-US"/>
+              </w:rPr>
+              <w:t>F1 Score</w:t>
+            </w:r>
+          </w:p>
+        </w:tc>
+      </w:tr>
+      <w:tr>
+        <w:tc>
+          <w:tcPr>
+            <w:tcW w:w="1731" w:type="dxa"/>
+          </w:tcPr>
+          <w:p>
+            <w:pPr>
+              <w:pStyle w:val="ListParagraph"/>
+              <w:ind w:left="0"/>
+              <w:rPr>
+                <w:rStyle w:val="BookTitle"/>
+                <w:b w:val="0"/>
+                <w:bCs w:val="0"/>
+                <w:i w:val="0"/>
+                <w:iCs w:val="0"/>
+                <w:lang w:val="en-US"/>
+              </w:rPr>
+            </w:pPr>
+            <w:r>
+              <w:rPr>
+                <w:rStyle w:val="BookTitle"/>
+                <w:b w:val="0"/>
+                <w:bCs w:val="0"/>
+                <w:i w:val="0"/>
+                <w:iCs w:val="0"/>
+                <w:lang w:val="en-US"/>
+              </w:rPr>
+              <w:t>Access</w:t>
+            </w:r>
+          </w:p>
+        </w:tc>
+        <w:tc>
+          <w:tcPr>
+            <w:tcW w:w="1731" w:type="dxa"/>
+          </w:tcPr>
+          <w:p>
+            <w:pPr>
+              <w:pStyle w:val="ListParagraph"/>
+              <w:ind w:left="0"/>
+              <w:rPr>
+                <w:rStyle w:val="BookTitle"/>
+                <w:b w:val="0"/>
+                <w:bCs w:val="0"/>
+                <w:i w:val="0"/>
+                <w:iCs w:val="0"/>
+                <w:lang w:val="en-US"/>
+              </w:rPr>
+            </w:pPr>
+            <w:r>
+              <w:rPr>
+                <w:rStyle w:val="BookTitle"/>
+                <w:b w:val="0"/>
+                <w:bCs w:val="0"/>
+                <w:i w:val="0"/>
+                <w:iCs w:val="0"/>
+                <w:lang w:val="en-US"/>
+              </w:rPr>
+              <w:t>92%</w:t>
+            </w:r>
+          </w:p>
+        </w:tc>
+        <w:tc>
+          <w:tcPr>
+            <w:tcW w:w="1732" w:type="dxa"/>
+          </w:tcPr>
+          <w:p>
+            <w:pPr>
+              <w:pStyle w:val="ListParagraph"/>
+              <w:ind w:left="0"/>
+              <w:rPr>
+                <w:rStyle w:val="BookTitle"/>
+                <w:b w:val="0"/>
+                <w:bCs w:val="0"/>
+                <w:i w:val="0"/>
+                <w:iCs w:val="0"/>
+                <w:lang w:val="en-US"/>
+              </w:rPr>
+            </w:pPr>
+            <w:r>
+              <w:rPr>
+                <w:rStyle w:val="BookTitle"/>
+                <w:b w:val="0"/>
+                <w:bCs w:val="0"/>
+                <w:i w:val="0"/>
+                <w:iCs w:val="0"/>
+                <w:lang w:val="en-US"/>
+              </w:rPr>
+              <w:t>87%</w:t>
+            </w:r>
+          </w:p>
+        </w:tc>
+        <w:tc>
+          <w:tcPr>
+            <w:tcW w:w="1732" w:type="dxa"/>
+          </w:tcPr>
+          <w:p>
+            <w:pPr>
+              <w:pStyle w:val="ListParagraph"/>
+              <w:ind w:left="0"/>
+              <w:rPr>
+                <w:rStyle w:val="BookTitle"/>
+                <w:b w:val="0"/>
+                <w:bCs w:val="0"/>
+                <w:i w:val="0"/>
+                <w:iCs w:val="0"/>
+                <w:lang w:val="en-US"/>
+              </w:rPr>
+            </w:pPr>
+            <w:r>
+              <w:rPr>
+                <w:rStyle w:val="BookTitle"/>
+                <w:b w:val="0"/>
+                <w:bCs w:val="0"/>
+                <w:i w:val="0"/>
+                <w:iCs w:val="0"/>
+                <w:lang w:val="en-US"/>
+              </w:rPr>
+              <w:t>89%</w:t>
+            </w:r>
+          </w:p>
+        </w:tc>
+      </w:tr>
+      <w:tr>
+        <w:tc>
+          <w:tcPr>
+            <w:tcW w:w="1731" w:type="dxa"/>
+          </w:tcPr>
+          <w:p>
+            <w:pPr>
+              <w:pStyle w:val="ListParagraph"/>
+              <w:ind w:left="0"/>
+              <w:rPr>
+                <w:rStyle w:val="BookTitle"/>
+                <w:b w:val="0"/>
+                <w:bCs w:val="0"/>
+                <w:i w:val="0"/>
+                <w:iCs w:val="0"/>
+                <w:lang w:val="en-US"/>
+              </w:rPr>
+            </w:pPr>
+            <w:r>
+              <w:rPr>
+                <w:rStyle w:val="BookTitle"/>
+                <w:b w:val="0"/>
+                <w:bCs w:val="0"/>
+                <w:i w:val="0"/>
+                <w:iCs w:val="0"/>
+                <w:lang w:val="en-US"/>
+              </w:rPr>
+              <w:t>Administrative Rights</w:t>
+            </w:r>
+          </w:p>
+        </w:tc>
+        <w:tc>
+          <w:tcPr>
+            <w:tcW w:w="1731" w:type="dxa"/>
+          </w:tcPr>
+          <w:p>
+            <w:pPr>
+              <w:pStyle w:val="ListParagraph"/>
+              <w:ind w:left="0"/>
+              <w:rPr>
+                <w:rStyle w:val="BookTitle"/>
+                <w:b w:val="0"/>
+                <w:bCs w:val="0"/>
+                <w:i w:val="0"/>
+                <w:iCs w:val="0"/>
+                <w:lang w:val="en-US"/>
+              </w:rPr>
+            </w:pPr>
+            <w:r>
+              <w:rPr>
+                <w:rStyle w:val="BookTitle"/>
+                <w:b w:val="0"/>
+                <w:bCs w:val="0"/>
+                <w:i w:val="0"/>
+                <w:iCs w:val="0"/>
+                <w:color w:val="EE0000"/>
+                <w:lang w:val="en-US"/>
+              </w:rPr>
+              <w:t>88%</w:t>
+            </w:r>
+          </w:p>
+        </w:tc>
+        <w:tc>
+          <w:tcPr>
+            <w:tcW w:w="1732" w:type="dxa"/>
+          </w:tcPr>
+          <w:p>
+            <w:pPr>
+              <w:pStyle w:val="ListParagraph"/>
+              <w:ind w:left="0"/>
+              <w:rPr>
+                <w:rStyle w:val="BookTitle"/>
+                <w:b w:val="0"/>
+                <w:bCs w:val="0"/>
+                <w:i w:val="0"/>
+                <w:iCs w:val="0"/>
+                <w:lang w:val="en-US"/>
+              </w:rPr>
+            </w:pPr>
+            <w:r>
+              <w:rPr>
+                <w:rStyle w:val="BookTitle"/>
+                <w:b w:val="0"/>
+                <w:bCs w:val="0"/>
+                <w:i w:val="0"/>
+                <w:iCs w:val="0"/>
+                <w:color w:val="EE0000"/>
+                <w:lang w:val="en-US"/>
+              </w:rPr>
+              <w:t>64%</w:t>
+            </w:r>
+          </w:p>
+        </w:tc>
+        <w:tc>
+          <w:tcPr>
+            <w:tcW w:w="1732" w:type="dxa"/>
+          </w:tcPr>
+          <w:p>
+            <w:pPr>
+              <w:pStyle w:val="ListParagraph"/>
+              <w:ind w:left="0"/>
+              <w:rPr>
+                <w:rStyle w:val="BookTitle"/>
+                <w:b w:val="0"/>
+                <w:bCs w:val="0"/>
+                <w:i w:val="0"/>
+                <w:iCs w:val="0"/>
+                <w:lang w:val="en-US"/>
+              </w:rPr>
+            </w:pPr>
+            <w:r>
+              <w:rPr>
+                <w:rStyle w:val="BookTitle"/>
+                <w:b w:val="0"/>
+                <w:bCs w:val="0"/>
+                <w:i w:val="0"/>
+                <w:iCs w:val="0"/>
+                <w:color w:val="EE0000"/>
+                <w:lang w:val="en-US"/>
+              </w:rPr>
+              <w:t>74%</w:t>
+            </w:r>
+          </w:p>
+        </w:tc>
+      </w:tr>
+      <w:tr>
+        <w:tc>
+          <w:tcPr>
+            <w:tcW w:w="1731" w:type="dxa"/>
+          </w:tcPr>
+          <w:p>
+            <w:pPr>
+              <w:pStyle w:val="ListParagraph"/>
+              <w:ind w:left="0"/>
+              <w:rPr>
+                <w:rStyle w:val="BookTitle"/>
+                <w:b w:val="0"/>
+                <w:bCs w:val="0"/>
+                <w:i w:val="0"/>
+                <w:iCs w:val="0"/>
+                <w:lang w:val="en-US"/>
+              </w:rPr>
+            </w:pPr>
+            <w:r>
+              <w:rPr>
+                <w:rStyle w:val="BookTitle"/>
+                <w:b w:val="0"/>
+                <w:bCs w:val="0"/>
+                <w:i w:val="0"/>
+                <w:iCs w:val="0"/>
+                <w:lang w:val="en-US"/>
+              </w:rPr>
+              <w:t>HR Support</w:t>
+            </w:r>
+          </w:p>
+        </w:tc>
+        <w:tc>
+          <w:tcPr>
+            <w:tcW w:w="1731" w:type="dxa"/>
+          </w:tcPr>
+          <w:p>
+            <w:pPr>
+              <w:pStyle w:val="ListParagraph"/>
+              <w:ind w:left="0"/>
+              <w:rPr>
+                <w:rStyle w:val="BookTitle"/>
+                <w:b w:val="0"/>
+                <w:bCs w:val="0"/>
+                <w:i w:val="0"/>
+                <w:iCs w:val="0"/>
+                <w:lang w:val="en-US"/>
+              </w:rPr>
+            </w:pPr>
+            <w:r>
+              <w:rPr>
+                <w:rStyle w:val="BookTitle"/>
+                <w:b w:val="0"/>
+                <w:bCs w:val="0"/>
+                <w:i w:val="0"/>
+                <w:iCs w:val="0"/>
+                <w:lang w:val="en-US"/>
+              </w:rPr>
+              <w:t>86%</w:t>
+            </w:r>
+          </w:p>
+        </w:tc>
+        <w:tc>
+          <w:tcPr>
+            <w:tcW w:w="1732" w:type="dxa"/>
+          </w:tcPr>
+          <w:p>
+            <w:pPr>
+              <w:pStyle w:val="ListParagraph"/>
+              <w:ind w:left="0"/>
+              <w:rPr>
+                <w:rStyle w:val="BookTitle"/>
+                <w:b w:val="0"/>
+                <w:bCs w:val="0"/>
+                <w:i w:val="0"/>
+                <w:iCs w:val="0"/>
+                <w:lang w:val="en-US"/>
+              </w:rPr>
+            </w:pPr>
+            <w:r>
+              <w:rPr>
+                <w:rStyle w:val="BookTitle"/>
+                <w:b w:val="0"/>
+                <w:bCs w:val="0"/>
+                <w:i w:val="0"/>
+                <w:iCs w:val="0"/>
+                <w:color w:val="EE0000"/>
+                <w:lang w:val="en-US"/>
+              </w:rPr>
+              <w:t>84%</w:t>
+            </w:r>
+          </w:p>
+        </w:tc>
+        <w:tc>
+          <w:tcPr>
+            <w:tcW w:w="1732" w:type="dxa"/>
+          </w:tcPr>
+          <w:p>
+            <w:pPr>
+              <w:pStyle w:val="ListParagraph"/>
+              <w:ind w:left="0"/>
+              <w:rPr>
+                <w:rStyle w:val="BookTitle"/>
+                <w:b w:val="0"/>
+                <w:bCs w:val="0"/>
+                <w:i w:val="0"/>
+                <w:iCs w:val="0"/>
+                <w:lang w:val="en-US"/>
+              </w:rPr>
+            </w:pPr>
+            <w:r>
+              <w:rPr>
+                <w:rStyle w:val="BookTitle"/>
+                <w:b w:val="0"/>
+                <w:bCs w:val="0"/>
+                <w:i w:val="0"/>
+                <w:iCs w:val="0"/>
+                <w:color w:val="EE0000"/>
+                <w:lang w:val="en-US"/>
+              </w:rPr>
+              <w:t>85%</w:t>
+            </w:r>
+          </w:p>
+        </w:tc>
+      </w:tr>
+      <w:tr>
+        <w:tc>
+          <w:tcPr>
+            <w:tcW w:w="1731" w:type="dxa"/>
+          </w:tcPr>
+          <w:p>
+            <w:pPr>
+              <w:pStyle w:val="ListParagraph"/>
+              <w:ind w:left="0"/>
+              <w:rPr>
+                <w:rStyle w:val="BookTitle"/>
+                <w:b w:val="0"/>
+                <w:bCs w:val="0"/>
+                <w:i w:val="0"/>
+                <w:iCs w:val="0"/>
+                <w:lang w:val="en-US"/>
+              </w:rPr>
+            </w:pPr>
+            <w:r>
+              <w:rPr>
+                <w:rStyle w:val="BookTitle"/>
+                <w:b w:val="0"/>
+                <w:bCs w:val="0"/>
+                <w:i w:val="0"/>
+                <w:iCs w:val="0"/>
+                <w:lang w:val="en-US"/>
+              </w:rPr>
+              <w:t>Hardware</w:t>
+            </w:r>
+          </w:p>
+        </w:tc>
+        <w:tc>
+          <w:tcPr>
+            <w:tcW w:w="1731" w:type="dxa"/>
+          </w:tcPr>
+          <w:p>
+            <w:pPr>
+              <w:pStyle w:val="ListParagraph"/>
+              <w:ind w:left="0"/>
+              <w:rPr>
+                <w:rStyle w:val="BookTitle"/>
+                <w:b w:val="0"/>
+                <w:bCs w:val="0"/>
+                <w:i w:val="0"/>
+                <w:iCs w:val="0"/>
+                <w:lang w:val="en-US"/>
+              </w:rPr>
+            </w:pPr>
+            <w:r>
+              <w:rPr>
+                <w:rStyle w:val="BookTitle"/>
+                <w:b w:val="0"/>
+                <w:bCs w:val="0"/>
+                <w:i w:val="0"/>
+                <w:iCs w:val="0"/>
+                <w:color w:val="EE0000"/>
+                <w:lang w:val="en-US"/>
+              </w:rPr>
+              <w:t>78%</w:t>
+            </w:r>
+          </w:p>
+        </w:tc>
+        <w:tc>
+          <w:tcPr>
+            <w:tcW w:w="1732" w:type="dxa"/>
+          </w:tcPr>
+          <w:p>
+            <w:pPr>
+              <w:pStyle w:val="ListParagraph"/>
+              <w:ind w:left="0"/>
+              <w:rPr>
+                <w:rStyle w:val="BookTitle"/>
+                <w:b w:val="0"/>
+                <w:bCs w:val="0"/>
+                <w:i w:val="0"/>
+                <w:iCs w:val="0"/>
+                <w:lang w:val="en-US"/>
+              </w:rPr>
+            </w:pPr>
+            <w:r>
+              <w:rPr>
+                <w:rStyle w:val="BookTitle"/>
+                <w:b w:val="0"/>
+                <w:bCs w:val="0"/>
+                <w:i w:val="0"/>
+                <w:iCs w:val="0"/>
+                <w:color w:val="EE0000"/>
+                <w:lang w:val="en-US"/>
+              </w:rPr>
+              <w:t>89%</w:t>
+            </w:r>
+          </w:p>
+        </w:tc>
+        <w:tc>
+          <w:tcPr>
+            <w:tcW w:w="1732" w:type="dxa"/>
+          </w:tcPr>
+          <w:p>
+            <w:pPr>
+              <w:pStyle w:val="ListParagraph"/>
+              <w:ind w:left="0"/>
+              <w:rPr>
+                <w:rStyle w:val="BookTitle"/>
+                <w:b w:val="0"/>
+                <w:bCs w:val="0"/>
+                <w:i w:val="0"/>
+                <w:iCs w:val="0"/>
+                <w:lang w:val="en-US"/>
+              </w:rPr>
+            </w:pPr>
+            <w:r>
+              <w:rPr>
+                <w:rStyle w:val="BookTitle"/>
+                <w:b w:val="0"/>
+                <w:bCs w:val="0"/>
+                <w:i w:val="0"/>
+                <w:iCs w:val="0"/>
+                <w:color w:val="EE0000"/>
+                <w:lang w:val="en-US"/>
+              </w:rPr>
+              <w:t>83%</w:t>
+            </w:r>
+          </w:p>
+        </w:tc>
+      </w:tr>
+      <w:tr>
+        <w:tc>
+          <w:tcPr>
+            <w:tcW w:w="1731" w:type="dxa"/>
+          </w:tcPr>
+          <w:p>
+            <w:pPr>
+              <w:pStyle w:val="ListParagraph"/>
+              <w:ind w:left="0"/>
+              <w:rPr>
+                <w:rStyle w:val="BookTitle"/>
+                <w:b w:val="0"/>
+                <w:bCs w:val="0"/>
+                <w:i w:val="0"/>
+                <w:iCs w:val="0"/>
+                <w:lang w:val="en-US"/>
+              </w:rPr>
+            </w:pPr>
+            <w:r>
+              <w:rPr>
+                <w:rStyle w:val="BookTitle"/>
+                <w:b w:val="0"/>
+                <w:bCs w:val="0"/>
+                <w:i w:val="0"/>
+                <w:iCs w:val="0"/>
+                <w:lang w:val="en-US"/>
+              </w:rPr>
+              <w:t>Internal Project</w:t>
+            </w:r>
+          </w:p>
+        </w:tc>
+        <w:tc>
+          <w:tcPr>
+            <w:tcW w:w="1731" w:type="dxa"/>
+          </w:tcPr>
+          <w:p>
+            <w:pPr>
+              <w:pStyle w:val="ListParagraph"/>
+              <w:ind w:left="0"/>
+              <w:rPr>
+                <w:rStyle w:val="BookTitle"/>
+                <w:b w:val="0"/>
+                <w:bCs w:val="0"/>
+                <w:i w:val="0"/>
+                <w:iCs w:val="0"/>
+                <w:lang w:val="en-US"/>
+              </w:rPr>
+            </w:pPr>
+            <w:r>
+              <w:rPr>
+                <w:rStyle w:val="BookTitle"/>
+                <w:b w:val="0"/>
+                <w:bCs w:val="0"/>
+                <w:i w:val="0"/>
+                <w:iCs w:val="0"/>
+                <w:color w:val="EE0000"/>
+                <w:lang w:val="en-US"/>
+              </w:rPr>
+              <w:t>91%</w:t>
+            </w:r>
+          </w:p>
+        </w:tc>
+        <w:tc>
+          <w:tcPr>
+            <w:tcW w:w="1732" w:type="dxa"/>
+          </w:tcPr>
+          <w:p>
+            <w:pPr>
+              <w:pStyle w:val="ListParagraph"/>
+              <w:ind w:left="0"/>
+              <w:rPr>
+                <w:rStyle w:val="BookTitle"/>
+                <w:b w:val="0"/>
+                <w:bCs w:val="0"/>
+                <w:i w:val="0"/>
+                <w:iCs w:val="0"/>
+                <w:lang w:val="en-US"/>
+              </w:rPr>
+            </w:pPr>
+            <w:r>
+              <w:rPr>
+                <w:rStyle w:val="BookTitle"/>
+                <w:b w:val="0"/>
+                <w:bCs w:val="0"/>
+                <w:i w:val="0"/>
+                <w:iCs w:val="0"/>
+                <w:lang w:val="en-US"/>
+              </w:rPr>
+              <w:t>81%</w:t>
+            </w:r>
+          </w:p>
+        </w:tc>
+        <w:tc>
+          <w:tcPr>
+            <w:tcW w:w="1732" w:type="dxa"/>
+          </w:tcPr>
+          <w:p>
+            <w:pPr>
+              <w:pStyle w:val="ListParagraph"/>
+              <w:ind w:left="0"/>
+              <w:rPr>
+                <w:rStyle w:val="BookTitle"/>
+                <w:b w:val="0"/>
+                <w:bCs w:val="0"/>
+                <w:i w:val="0"/>
+                <w:iCs w:val="0"/>
+                <w:lang w:val="en-US"/>
+              </w:rPr>
+            </w:pPr>
+            <w:r>
+              <w:rPr>
+                <w:rStyle w:val="BookTitle"/>
+                <w:b w:val="0"/>
+                <w:bCs w:val="0"/>
+                <w:i w:val="0"/>
+                <w:iCs w:val="0"/>
+                <w:lang w:val="en-US"/>
+              </w:rPr>
+              <w:t>86%</w:t>
+            </w:r>
+          </w:p>
+        </w:tc>
+      </w:tr>
+      <w:tr>
+        <w:tc>
+          <w:tcPr>
+            <w:tcW w:w="1731" w:type="dxa"/>
+          </w:tcPr>
+          <w:p>
+            <w:pPr>
+              <w:pStyle w:val="ListParagraph"/>
+              <w:ind w:left="0"/>
+              <w:rPr>
+                <w:rStyle w:val="BookTitle"/>
+                <w:b w:val="0"/>
+                <w:bCs w:val="0"/>
+                <w:i w:val="0"/>
+                <w:iCs w:val="0"/>
+                <w:lang w:val="en-US"/>
+              </w:rPr>
+            </w:pPr>
+            <w:r>
+              <w:rPr>
+                <w:rStyle w:val="BookTitle"/>
+                <w:b w:val="0"/>
+                <w:bCs w:val="0"/>
+                <w:i w:val="0"/>
+                <w:iCs w:val="0"/>
+                <w:lang w:val="en-US"/>
+              </w:rPr>
+              <w:t>Miscellaneous</w:t>
+            </w:r>
+          </w:p>
+        </w:tc>
+        <w:tc>
+          <w:tcPr>
+            <w:tcW w:w="1731" w:type="dxa"/>
+          </w:tcPr>
+          <w:p>
+            <w:pPr>
+              <w:pStyle w:val="ListParagraph"/>
+              <w:ind w:left="0"/>
+              <w:rPr>
+                <w:rStyle w:val="BookTitle"/>
+                <w:b w:val="0"/>
+                <w:bCs w:val="0"/>
+                <w:i w:val="0"/>
+                <w:iCs w:val="0"/>
+                <w:lang w:val="en-US"/>
+              </w:rPr>
+            </w:pPr>
+            <w:r>
+              <w:rPr>
+                <w:rStyle w:val="BookTitle"/>
+                <w:b w:val="0"/>
+                <w:bCs w:val="0"/>
+                <w:i w:val="0"/>
+                <w:iCs w:val="0"/>
+                <w:color w:val="EE0000"/>
+                <w:lang w:val="en-US"/>
+              </w:rPr>
+              <w:t>83%</w:t>
+            </w:r>
+          </w:p>
+        </w:tc>
+        <w:tc>
+          <w:tcPr>
+            <w:tcW w:w="1732" w:type="dxa"/>
+          </w:tcPr>
+          <w:p>
+            <w:pPr>
+              <w:pStyle w:val="ListParagraph"/>
+              <w:ind w:left="0"/>
+              <w:rPr>
+                <w:rStyle w:val="BookTitle"/>
+                <w:b w:val="0"/>
+                <w:bCs w:val="0"/>
+                <w:i w:val="0"/>
+                <w:iCs w:val="0"/>
+                <w:lang w:val="en-US"/>
+              </w:rPr>
+            </w:pPr>
+            <w:r>
+              <w:rPr>
+                <w:rStyle w:val="BookTitle"/>
+                <w:b w:val="0"/>
+                <w:bCs w:val="0"/>
+                <w:i w:val="0"/>
+                <w:iCs w:val="0"/>
+                <w:lang w:val="en-US"/>
+              </w:rPr>
+              <w:t>83%</w:t>
+            </w:r>
+          </w:p>
+        </w:tc>
+        <w:tc>
+          <w:tcPr>
+            <w:tcW w:w="1732" w:type="dxa"/>
+          </w:tcPr>
+          <w:p>
+            <w:pPr>
+              <w:pStyle w:val="ListParagraph"/>
+              <w:ind w:left="0"/>
+              <w:rPr>
+                <w:rStyle w:val="BookTitle"/>
+                <w:b w:val="0"/>
+                <w:bCs w:val="0"/>
+                <w:i w:val="0"/>
+                <w:iCs w:val="0"/>
+                <w:lang w:val="en-US"/>
+              </w:rPr>
+            </w:pPr>
+            <w:r>
+              <w:rPr>
+                <w:rStyle w:val="BookTitle"/>
+                <w:b w:val="0"/>
+                <w:bCs w:val="0"/>
+                <w:i w:val="0"/>
+                <w:iCs w:val="0"/>
+                <w:lang w:val="en-US"/>
+              </w:rPr>
+              <w:t>83%</w:t>
+            </w:r>
+          </w:p>
+        </w:tc>
+      </w:tr>
+      <w:tr>
+        <w:tc>
+          <w:tcPr>
+            <w:tcW w:w="1731" w:type="dxa"/>
+          </w:tcPr>
+          <w:p>
+            <w:pPr>
+              <w:pStyle w:val="ListParagraph"/>
+              <w:ind w:left="0"/>
+              <w:rPr>
+                <w:rStyle w:val="BookTitle"/>
+                <w:b w:val="0"/>
+                <w:bCs w:val="0"/>
+                <w:i w:val="0"/>
+                <w:iCs w:val="0"/>
+                <w:lang w:val="en-US"/>
+              </w:rPr>
+            </w:pPr>
+            <w:r>
+              <w:rPr>
+                <w:rStyle w:val="BookTitle"/>
+                <w:b w:val="0"/>
+                <w:bCs w:val="0"/>
+                <w:i w:val="0"/>
+                <w:iCs w:val="0"/>
+                <w:lang w:val="en-US"/>
+              </w:rPr>
+              <w:t>Purchase</w:t>
+            </w:r>
+          </w:p>
+        </w:tc>
+        <w:tc>
+          <w:tcPr>
+            <w:tcW w:w="1731" w:type="dxa"/>
+          </w:tcPr>
+          <w:p>
+            <w:pPr>
+              <w:pStyle w:val="ListParagraph"/>
+              <w:ind w:left="0"/>
+              <w:rPr>
+                <w:rStyle w:val="BookTitle"/>
+                <w:b w:val="0"/>
+                <w:bCs w:val="0"/>
+                <w:i w:val="0"/>
+                <w:iCs w:val="0"/>
+                <w:lang w:val="en-US"/>
+              </w:rPr>
+            </w:pPr>
+            <w:r>
+              <w:rPr>
+                <w:rStyle w:val="BookTitle"/>
+                <w:b w:val="0"/>
+                <w:bCs w:val="0"/>
+                <w:i w:val="0"/>
+                <w:iCs w:val="0"/>
+                <w:lang w:val="en-US"/>
+              </w:rPr>
+              <w:t>98%</w:t>
+            </w:r>
+          </w:p>
+        </w:tc>
+        <w:tc>
+          <w:tcPr>
+            <w:tcW w:w="1732" w:type="dxa"/>
+          </w:tcPr>
+          <w:p>
+            <w:pPr>
+              <w:pStyle w:val="ListParagraph"/>
+              <w:ind w:left="0"/>
+              <w:rPr>
+                <w:rStyle w:val="BookTitle"/>
+                <w:b w:val="0"/>
+                <w:bCs w:val="0"/>
+                <w:i w:val="0"/>
+                <w:iCs w:val="0"/>
+                <w:lang w:val="en-US"/>
+              </w:rPr>
+            </w:pPr>
+            <w:r>
+              <w:rPr>
+                <w:rStyle w:val="BookTitle"/>
+                <w:b w:val="0"/>
+                <w:bCs w:val="0"/>
+                <w:i w:val="0"/>
+                <w:iCs w:val="0"/>
+                <w:color w:val="EE0000"/>
+                <w:lang w:val="en-US"/>
+              </w:rPr>
+              <w:t>86%</w:t>
+            </w:r>
+          </w:p>
+        </w:tc>
+        <w:tc>
+          <w:tcPr>
+            <w:tcW w:w="1732" w:type="dxa"/>
+          </w:tcPr>
+          <w:p>
+            <w:pPr>
+              <w:pStyle w:val="ListParagraph"/>
+              <w:ind w:left="0"/>
+              <w:rPr>
+                <w:rStyle w:val="BookTitle"/>
+                <w:b w:val="0"/>
+                <w:bCs w:val="0"/>
+                <w:i w:val="0"/>
+                <w:iCs w:val="0"/>
+                <w:lang w:val="en-US"/>
+              </w:rPr>
+            </w:pPr>
+            <w:r>
+              <w:rPr>
+                <w:rStyle w:val="BookTitle"/>
+                <w:b w:val="0"/>
+                <w:bCs w:val="0"/>
+                <w:i w:val="0"/>
+                <w:iCs w:val="0"/>
+                <w:lang w:val="en-US"/>
+              </w:rPr>
+              <w:t>92%</w:t>
+            </w:r>
+          </w:p>
+        </w:tc>
+      </w:tr>
+      <w:tr>
+        <w:tc>
+          <w:tcPr>
+            <w:tcW w:w="1731" w:type="dxa"/>
+          </w:tcPr>
+          <w:p>
+            <w:pPr>
+              <w:pStyle w:val="ListParagraph"/>
+              <w:ind w:left="0"/>
+              <w:rPr>
+                <w:rStyle w:val="BookTitle"/>
+                <w:b w:val="0"/>
+                <w:bCs w:val="0"/>
+                <w:i w:val="0"/>
+                <w:iCs w:val="0"/>
+                <w:lang w:val="en-US"/>
+              </w:rPr>
+            </w:pPr>
+            <w:r>
+              <w:rPr>
+                <w:rStyle w:val="BookTitle"/>
+                <w:b w:val="0"/>
+                <w:bCs w:val="0"/>
+                <w:i w:val="0"/>
+                <w:iCs w:val="0"/>
+                <w:lang w:val="en-US"/>
+              </w:rPr>
+              <w:t>Storage</w:t>
+            </w:r>
+          </w:p>
+        </w:tc>
+        <w:tc>
+          <w:tcPr>
+            <w:tcW w:w="1731" w:type="dxa"/>
+          </w:tcPr>
+          <w:p>
+            <w:pPr>
+              <w:pStyle w:val="ListParagraph"/>
+              <w:ind w:left="0"/>
+              <w:rPr>
+                <w:rStyle w:val="BookTitle"/>
+                <w:b w:val="0"/>
+                <w:bCs w:val="0"/>
+                <w:i w:val="0"/>
+                <w:iCs w:val="0"/>
+                <w:lang w:val="en-US"/>
+              </w:rPr>
+            </w:pPr>
+            <w:r>
+              <w:rPr>
+                <w:rStyle w:val="BookTitle"/>
+                <w:b w:val="0"/>
+                <w:bCs w:val="0"/>
+                <w:i w:val="0"/>
+                <w:iCs w:val="0"/>
+                <w:color w:val="EE0000"/>
+                <w:lang w:val="en-US"/>
+              </w:rPr>
+              <w:t>94%</w:t>
+            </w:r>
+          </w:p>
+        </w:tc>
+        <w:tc>
+          <w:tcPr>
+            <w:tcW w:w="1732" w:type="dxa"/>
+          </w:tcPr>
+          <w:p>
+            <w:pPr>
+              <w:pStyle w:val="ListParagraph"/>
+              <w:ind w:left="0"/>
+              <w:rPr>
+                <w:rStyle w:val="BookTitle"/>
+                <w:b w:val="0"/>
+                <w:bCs w:val="0"/>
+                <w:i w:val="0"/>
+                <w:iCs w:val="0"/>
+                <w:lang w:val="en-US"/>
+              </w:rPr>
+            </w:pPr>
+            <w:r>
+              <w:rPr>
+                <w:rStyle w:val="BookTitle"/>
+                <w:b w:val="0"/>
+                <w:bCs w:val="0"/>
+                <w:i w:val="0"/>
+                <w:iCs w:val="0"/>
+                <w:color w:val="EE0000"/>
+                <w:lang w:val="en-US"/>
+              </w:rPr>
+              <w:t>86%</w:t>
+            </w:r>
+          </w:p>
+        </w:tc>
+        <w:tc>
+          <w:tcPr>
+            <w:tcW w:w="1732" w:type="dxa"/>
+          </w:tcPr>
+          <w:p>
+            <w:pPr>
+              <w:pStyle w:val="ListParagraph"/>
+              <w:ind w:left="0"/>
+              <w:rPr>
+                <w:rStyle w:val="BookTitle"/>
+                <w:b w:val="0"/>
+                <w:bCs w:val="0"/>
+                <w:i w:val="0"/>
+                <w:iCs w:val="0"/>
+                <w:lang w:val="en-US"/>
+              </w:rPr>
+            </w:pPr>
+            <w:r>
+              <w:rPr>
+                <w:rStyle w:val="BookTitle"/>
+                <w:b w:val="0"/>
+                <w:bCs w:val="0"/>
+                <w:i w:val="0"/>
+                <w:iCs w:val="0"/>
+                <w:lang w:val="en-US"/>
+              </w:rPr>
+              <w:t>90%</w:t>
+            </w:r>
+          </w:p>
+        </w:tc>
+      </w:tr>
+    </w:tbl>
+    <w:p>
+      <w:pPr>
+        <w:pStyle w:val="ListParagraph"/>
+        <w:spacing w:after="0"/>
+        <w:ind w:left="357"/>
+        <w:rPr>
+          <w:rStyle w:val="BookTitle"/>
+          <w:b w:val="0"/>
+          <w:bCs w:val="0"/>
+          <w:i w:val="0"/>
+          <w:iCs w:val="0"/>
+          <w:lang w:val="en-US"/>
+        </w:rPr>
+      </w:pPr>
     </w:p>
     <w:p>
       <w:pPr>

</xml_diff>

<commit_message>
Added Comparison of - Logistic, Multinomial, Linear SVM & Random Forest
</commit_message>
<xml_diff>
--- a/Comparison/Comparison.docx
+++ b/Comparison/Comparison.docx
@@ -3475,6 +3475,1265 @@
           <w:lang w:val="en-US"/>
         </w:rPr>
       </w:pPr>
+      <w:proofErr w:type="spellStart"/>
+      <w:r>
+        <w:rPr>
+          <w:rStyle w:val="BookTitle"/>
+          <w:b w:val="0"/>
+          <w:bCs w:val="0"/>
+          <w:i w:val="0"/>
+          <w:iCs w:val="0"/>
+          <w:lang w:val="en-US"/>
+        </w:rPr>
+        <w:lastRenderedPageBreak/>
+        <w:t>custom_stopwords</w:t>
+      </w:r>
+      <w:proofErr w:type="spellEnd"/>
+      <w:r>
+        <w:rPr>
+          <w:rStyle w:val="BookTitle"/>
+          <w:b w:val="0"/>
+          <w:bCs w:val="0"/>
+          <w:i w:val="0"/>
+          <w:iCs w:val="0"/>
+          <w:lang w:val="en-US"/>
+        </w:rPr>
+        <w:t xml:space="preserve"> = {"dear", "hello", "hi", "please", "thanks", "thank", "regards", "regard", "kind", "kindly", "best", "</w:t>
+      </w:r>
+      <w:proofErr w:type="spellStart"/>
+      <w:r>
+        <w:rPr>
+          <w:rStyle w:val="BookTitle"/>
+          <w:b w:val="0"/>
+          <w:bCs w:val="0"/>
+          <w:i w:val="0"/>
+          <w:iCs w:val="0"/>
+          <w:lang w:val="en-US"/>
+        </w:rPr>
+        <w:t>monday</w:t>
+      </w:r>
+      <w:proofErr w:type="spellEnd"/>
+      <w:r>
+        <w:rPr>
+          <w:rStyle w:val="BookTitle"/>
+          <w:b w:val="0"/>
+          <w:bCs w:val="0"/>
+          <w:i w:val="0"/>
+          <w:iCs w:val="0"/>
+          <w:lang w:val="en-US"/>
+        </w:rPr>
+        <w:t>", "</w:t>
+      </w:r>
+      <w:proofErr w:type="spellStart"/>
+      <w:r>
+        <w:rPr>
+          <w:rStyle w:val="BookTitle"/>
+          <w:b w:val="0"/>
+          <w:bCs w:val="0"/>
+          <w:i w:val="0"/>
+          <w:iCs w:val="0"/>
+          <w:lang w:val="en-US"/>
+        </w:rPr>
+        <w:t>tuesday</w:t>
+      </w:r>
+      <w:proofErr w:type="spellEnd"/>
+      <w:r>
+        <w:rPr>
+          <w:rStyle w:val="BookTitle"/>
+          <w:b w:val="0"/>
+          <w:bCs w:val="0"/>
+          <w:i w:val="0"/>
+          <w:iCs w:val="0"/>
+          <w:lang w:val="en-US"/>
+        </w:rPr>
+        <w:t>", "</w:t>
+      </w:r>
+      <w:proofErr w:type="spellStart"/>
+      <w:r>
+        <w:rPr>
+          <w:rStyle w:val="BookTitle"/>
+          <w:b w:val="0"/>
+          <w:bCs w:val="0"/>
+          <w:i w:val="0"/>
+          <w:iCs w:val="0"/>
+          <w:lang w:val="en-US"/>
+        </w:rPr>
+        <w:t>wednesday</w:t>
+      </w:r>
+      <w:proofErr w:type="spellEnd"/>
+      <w:r>
+        <w:rPr>
+          <w:rStyle w:val="BookTitle"/>
+          <w:b w:val="0"/>
+          <w:bCs w:val="0"/>
+          <w:i w:val="0"/>
+          <w:iCs w:val="0"/>
+          <w:lang w:val="en-US"/>
+        </w:rPr>
+        <w:t>", "</w:t>
+      </w:r>
+      <w:proofErr w:type="spellStart"/>
+      <w:r>
+        <w:rPr>
+          <w:rStyle w:val="BookTitle"/>
+          <w:b w:val="0"/>
+          <w:bCs w:val="0"/>
+          <w:i w:val="0"/>
+          <w:iCs w:val="0"/>
+          <w:lang w:val="en-US"/>
+        </w:rPr>
+        <w:t>thursday</w:t>
+      </w:r>
+      <w:proofErr w:type="spellEnd"/>
+      <w:r>
+        <w:rPr>
+          <w:rStyle w:val="BookTitle"/>
+          <w:b w:val="0"/>
+          <w:bCs w:val="0"/>
+          <w:i w:val="0"/>
+          <w:iCs w:val="0"/>
+          <w:lang w:val="en-US"/>
+        </w:rPr>
+        <w:t>", "</w:t>
+      </w:r>
+      <w:proofErr w:type="spellStart"/>
+      <w:r>
+        <w:rPr>
+          <w:rStyle w:val="BookTitle"/>
+          <w:b w:val="0"/>
+          <w:bCs w:val="0"/>
+          <w:i w:val="0"/>
+          <w:iCs w:val="0"/>
+          <w:lang w:val="en-US"/>
+        </w:rPr>
+        <w:t>friday</w:t>
+      </w:r>
+      <w:proofErr w:type="spellEnd"/>
+      <w:r>
+        <w:rPr>
+          <w:rStyle w:val="BookTitle"/>
+          <w:b w:val="0"/>
+          <w:bCs w:val="0"/>
+          <w:i w:val="0"/>
+          <w:iCs w:val="0"/>
+          <w:lang w:val="en-US"/>
+        </w:rPr>
+        <w:t>", "</w:t>
+      </w:r>
+      <w:proofErr w:type="spellStart"/>
+      <w:r>
+        <w:rPr>
+          <w:rStyle w:val="BookTitle"/>
+          <w:b w:val="0"/>
+          <w:bCs w:val="0"/>
+          <w:i w:val="0"/>
+          <w:iCs w:val="0"/>
+          <w:lang w:val="en-US"/>
+        </w:rPr>
+        <w:t>january</w:t>
+      </w:r>
+      <w:proofErr w:type="spellEnd"/>
+      <w:r>
+        <w:rPr>
+          <w:rStyle w:val="BookTitle"/>
+          <w:b w:val="0"/>
+          <w:bCs w:val="0"/>
+          <w:i w:val="0"/>
+          <w:iCs w:val="0"/>
+          <w:lang w:val="en-US"/>
+        </w:rPr>
+        <w:t>", "</w:t>
+      </w:r>
+      <w:proofErr w:type="spellStart"/>
+      <w:r>
+        <w:rPr>
+          <w:rStyle w:val="BookTitle"/>
+          <w:b w:val="0"/>
+          <w:bCs w:val="0"/>
+          <w:i w:val="0"/>
+          <w:iCs w:val="0"/>
+          <w:lang w:val="en-US"/>
+        </w:rPr>
+        <w:t>february</w:t>
+      </w:r>
+      <w:proofErr w:type="spellEnd"/>
+      <w:r>
+        <w:rPr>
+          <w:rStyle w:val="BookTitle"/>
+          <w:b w:val="0"/>
+          <w:bCs w:val="0"/>
+          <w:i w:val="0"/>
+          <w:iCs w:val="0"/>
+          <w:lang w:val="en-US"/>
+        </w:rPr>
+        <w:t>", "march", "</w:t>
+      </w:r>
+      <w:proofErr w:type="spellStart"/>
+      <w:r>
+        <w:rPr>
+          <w:rStyle w:val="BookTitle"/>
+          <w:b w:val="0"/>
+          <w:bCs w:val="0"/>
+          <w:i w:val="0"/>
+          <w:iCs w:val="0"/>
+          <w:lang w:val="en-US"/>
+        </w:rPr>
+        <w:t>april</w:t>
+      </w:r>
+      <w:proofErr w:type="spellEnd"/>
+      <w:r>
+        <w:rPr>
+          <w:rStyle w:val="BookTitle"/>
+          <w:b w:val="0"/>
+          <w:bCs w:val="0"/>
+          <w:i w:val="0"/>
+          <w:iCs w:val="0"/>
+          <w:lang w:val="en-US"/>
+        </w:rPr>
+        <w:t>", "may", "</w:t>
+      </w:r>
+      <w:proofErr w:type="spellStart"/>
+      <w:r>
+        <w:rPr>
+          <w:rStyle w:val="BookTitle"/>
+          <w:b w:val="0"/>
+          <w:bCs w:val="0"/>
+          <w:i w:val="0"/>
+          <w:iCs w:val="0"/>
+          <w:lang w:val="en-US"/>
+        </w:rPr>
+        <w:t>june</w:t>
+      </w:r>
+      <w:proofErr w:type="spellEnd"/>
+      <w:r>
+        <w:rPr>
+          <w:rStyle w:val="BookTitle"/>
+          <w:b w:val="0"/>
+          <w:bCs w:val="0"/>
+          <w:i w:val="0"/>
+          <w:iCs w:val="0"/>
+          <w:lang w:val="en-US"/>
+        </w:rPr>
+        <w:t>", "</w:t>
+      </w:r>
+      <w:proofErr w:type="spellStart"/>
+      <w:r>
+        <w:rPr>
+          <w:rStyle w:val="BookTitle"/>
+          <w:b w:val="0"/>
+          <w:bCs w:val="0"/>
+          <w:i w:val="0"/>
+          <w:iCs w:val="0"/>
+          <w:lang w:val="en-US"/>
+        </w:rPr>
+        <w:t>july</w:t>
+      </w:r>
+      <w:proofErr w:type="spellEnd"/>
+      <w:r>
+        <w:rPr>
+          <w:rStyle w:val="BookTitle"/>
+          <w:b w:val="0"/>
+          <w:bCs w:val="0"/>
+          <w:i w:val="0"/>
+          <w:iCs w:val="0"/>
+          <w:lang w:val="en-US"/>
+        </w:rPr>
+        <w:t>", "august", "</w:t>
+      </w:r>
+      <w:proofErr w:type="spellStart"/>
+      <w:r>
+        <w:rPr>
+          <w:rStyle w:val="BookTitle"/>
+          <w:b w:val="0"/>
+          <w:bCs w:val="0"/>
+          <w:i w:val="0"/>
+          <w:iCs w:val="0"/>
+          <w:lang w:val="en-US"/>
+        </w:rPr>
+        <w:t>september</w:t>
+      </w:r>
+      <w:proofErr w:type="spellEnd"/>
+      <w:r>
+        <w:rPr>
+          <w:rStyle w:val="BookTitle"/>
+          <w:b w:val="0"/>
+          <w:bCs w:val="0"/>
+          <w:i w:val="0"/>
+          <w:iCs w:val="0"/>
+          <w:lang w:val="en-US"/>
+        </w:rPr>
+        <w:t>", "</w:t>
+      </w:r>
+      <w:proofErr w:type="spellStart"/>
+      <w:r>
+        <w:rPr>
+          <w:rStyle w:val="BookTitle"/>
+          <w:b w:val="0"/>
+          <w:bCs w:val="0"/>
+          <w:i w:val="0"/>
+          <w:iCs w:val="0"/>
+          <w:lang w:val="en-US"/>
+        </w:rPr>
+        <w:t>october</w:t>
+      </w:r>
+      <w:proofErr w:type="spellEnd"/>
+      <w:r>
+        <w:rPr>
+          <w:rStyle w:val="BookTitle"/>
+          <w:b w:val="0"/>
+          <w:bCs w:val="0"/>
+          <w:i w:val="0"/>
+          <w:iCs w:val="0"/>
+          <w:lang w:val="en-US"/>
+        </w:rPr>
+        <w:t>", "</w:t>
+      </w:r>
+      <w:proofErr w:type="spellStart"/>
+      <w:r>
+        <w:rPr>
+          <w:rStyle w:val="BookTitle"/>
+          <w:b w:val="0"/>
+          <w:bCs w:val="0"/>
+          <w:i w:val="0"/>
+          <w:iCs w:val="0"/>
+          <w:lang w:val="en-US"/>
+        </w:rPr>
+        <w:t>november</w:t>
+      </w:r>
+      <w:proofErr w:type="spellEnd"/>
+      <w:r>
+        <w:rPr>
+          <w:rStyle w:val="BookTitle"/>
+          <w:b w:val="0"/>
+          <w:bCs w:val="0"/>
+          <w:i w:val="0"/>
+          <w:iCs w:val="0"/>
+          <w:lang w:val="en-US"/>
+        </w:rPr>
+        <w:t>", "</w:t>
+      </w:r>
+      <w:proofErr w:type="spellStart"/>
+      <w:r>
+        <w:rPr>
+          <w:rStyle w:val="BookTitle"/>
+          <w:b w:val="0"/>
+          <w:bCs w:val="0"/>
+          <w:i w:val="0"/>
+          <w:iCs w:val="0"/>
+          <w:lang w:val="en-US"/>
+        </w:rPr>
+        <w:t>december</w:t>
+      </w:r>
+      <w:proofErr w:type="spellEnd"/>
+      <w:r>
+        <w:rPr>
+          <w:rStyle w:val="BookTitle"/>
+          <w:b w:val="0"/>
+          <w:bCs w:val="0"/>
+          <w:i w:val="0"/>
+          <w:iCs w:val="0"/>
+          <w:lang w:val="en-US"/>
+        </w:rPr>
+        <w:t>", "pm", "am", "sent", "attached", "attachment", "forwarded", "</w:t>
+      </w:r>
+      <w:proofErr w:type="spellStart"/>
+      <w:r>
+        <w:rPr>
+          <w:rStyle w:val="BookTitle"/>
+          <w:b w:val="0"/>
+          <w:bCs w:val="0"/>
+          <w:i w:val="0"/>
+          <w:iCs w:val="0"/>
+          <w:lang w:val="en-US"/>
+        </w:rPr>
+        <w:t>ext</w:t>
+      </w:r>
+      <w:proofErr w:type="spellEnd"/>
+      <w:r>
+        <w:rPr>
+          <w:rStyle w:val="BookTitle"/>
+          <w:b w:val="0"/>
+          <w:bCs w:val="0"/>
+          <w:i w:val="0"/>
+          <w:iCs w:val="0"/>
+          <w:lang w:val="en-US"/>
+        </w:rPr>
+        <w:t>", "let", "good", "morning", "afternoon", "evening", "could", "also"}</w:t>
+      </w:r>
+    </w:p>
+    <w:p>
+      <w:pPr>
+        <w:pStyle w:val="ListParagraph"/>
+        <w:spacing w:after="0"/>
+        <w:ind w:left="357"/>
+        <w:rPr>
+          <w:rStyle w:val="BookTitle"/>
+          <w:b w:val="0"/>
+          <w:bCs w:val="0"/>
+          <w:i w:val="0"/>
+          <w:iCs w:val="0"/>
+          <w:lang w:val="en-US"/>
+        </w:rPr>
+      </w:pPr>
+    </w:p>
+    <w:p>
+      <w:pPr>
+        <w:pStyle w:val="ListParagraph"/>
+        <w:numPr>
+          <w:ilvl w:val="0"/>
+          <w:numId w:val="1"/>
+        </w:numPr>
+        <w:spacing w:after="0"/>
+        <w:ind w:left="357" w:hanging="357"/>
+        <w:rPr>
+          <w:rStyle w:val="BookTitle"/>
+          <w:i w:val="0"/>
+          <w:iCs w:val="0"/>
+          <w:sz w:val="28"/>
+          <w:szCs w:val="28"/>
+          <w:lang w:val="en-US"/>
+        </w:rPr>
+      </w:pPr>
+      <w:r>
+        <w:rPr>
+          <w:rStyle w:val="BookTitle"/>
+          <w:i w:val="0"/>
+          <w:iCs w:val="0"/>
+          <w:sz w:val="28"/>
+          <w:szCs w:val="28"/>
+          <w:lang w:val="en-US"/>
+        </w:rPr>
+        <w:t>Model Comparison</w:t>
+      </w:r>
+    </w:p>
+    <w:p>
+      <w:pPr>
+        <w:pStyle w:val="ListParagraph"/>
+        <w:spacing w:after="0"/>
+        <w:ind w:left="357"/>
+        <w:rPr>
+          <w:rStyle w:val="BookTitle"/>
+          <w:i w:val="0"/>
+          <w:iCs w:val="0"/>
+          <w:sz w:val="28"/>
+          <w:szCs w:val="28"/>
+          <w:lang w:val="en-US"/>
+        </w:rPr>
+      </w:pPr>
+    </w:p>
+    <w:tbl>
+      <w:tblPr>
+        <w:tblStyle w:val="TableGrid"/>
+        <w:tblW w:w="0" w:type="auto"/>
+        <w:tblInd w:w="357" w:type="dxa"/>
+        <w:tblLook w:val="04A0" w:firstRow="1" w:lastRow="0" w:firstColumn="1" w:lastColumn="0" w:noHBand="0" w:noVBand="1"/>
+      </w:tblPr>
+      <w:tblGrid>
+        <w:gridCol w:w="1731"/>
+        <w:gridCol w:w="1731"/>
+        <w:gridCol w:w="1732"/>
+        <w:gridCol w:w="1732"/>
+        <w:gridCol w:w="1733"/>
+      </w:tblGrid>
+      <w:tr>
+        <w:tc>
+          <w:tcPr>
+            <w:tcW w:w="1731" w:type="dxa"/>
+          </w:tcPr>
+          <w:p>
+            <w:pPr>
+              <w:pStyle w:val="ListParagraph"/>
+              <w:ind w:left="0"/>
+              <w:rPr>
+                <w:rStyle w:val="BookTitle"/>
+                <w:b w:val="0"/>
+                <w:bCs w:val="0"/>
+                <w:i w:val="0"/>
+                <w:iCs w:val="0"/>
+                <w:lang w:val="en-US"/>
+              </w:rPr>
+            </w:pPr>
+            <w:r>
+              <w:rPr>
+                <w:rStyle w:val="BookTitle"/>
+                <w:b w:val="0"/>
+                <w:bCs w:val="0"/>
+                <w:i w:val="0"/>
+                <w:iCs w:val="0"/>
+                <w:lang w:val="en-US"/>
+              </w:rPr>
+              <w:t>Model</w:t>
+            </w:r>
+          </w:p>
+        </w:tc>
+        <w:tc>
+          <w:tcPr>
+            <w:tcW w:w="1731" w:type="dxa"/>
+          </w:tcPr>
+          <w:p>
+            <w:pPr>
+              <w:pStyle w:val="ListParagraph"/>
+              <w:ind w:left="0"/>
+              <w:rPr>
+                <w:rStyle w:val="BookTitle"/>
+                <w:b w:val="0"/>
+                <w:bCs w:val="0"/>
+                <w:i w:val="0"/>
+                <w:iCs w:val="0"/>
+                <w:lang w:val="en-US"/>
+              </w:rPr>
+            </w:pPr>
+            <w:r>
+              <w:rPr>
+                <w:rStyle w:val="BookTitle"/>
+                <w:b w:val="0"/>
+                <w:bCs w:val="0"/>
+                <w:i w:val="0"/>
+                <w:iCs w:val="0"/>
+                <w:lang w:val="en-US"/>
+              </w:rPr>
+              <w:t>Accuracy</w:t>
+            </w:r>
+          </w:p>
+        </w:tc>
+        <w:tc>
+          <w:tcPr>
+            <w:tcW w:w="1732" w:type="dxa"/>
+          </w:tcPr>
+          <w:p>
+            <w:pPr>
+              <w:pStyle w:val="ListParagraph"/>
+              <w:ind w:left="0"/>
+              <w:rPr>
+                <w:rStyle w:val="BookTitle"/>
+                <w:b w:val="0"/>
+                <w:bCs w:val="0"/>
+                <w:i w:val="0"/>
+                <w:iCs w:val="0"/>
+                <w:lang w:val="en-US"/>
+              </w:rPr>
+            </w:pPr>
+            <w:r>
+              <w:rPr>
+                <w:rStyle w:val="BookTitle"/>
+                <w:b w:val="0"/>
+                <w:bCs w:val="0"/>
+                <w:i w:val="0"/>
+                <w:iCs w:val="0"/>
+                <w:lang w:val="en-US"/>
+              </w:rPr>
+              <w:t>Precision</w:t>
+            </w:r>
+          </w:p>
+        </w:tc>
+        <w:tc>
+          <w:tcPr>
+            <w:tcW w:w="1732" w:type="dxa"/>
+          </w:tcPr>
+          <w:p>
+            <w:pPr>
+              <w:pStyle w:val="ListParagraph"/>
+              <w:ind w:left="0"/>
+              <w:rPr>
+                <w:rStyle w:val="BookTitle"/>
+                <w:b w:val="0"/>
+                <w:bCs w:val="0"/>
+                <w:i w:val="0"/>
+                <w:iCs w:val="0"/>
+                <w:lang w:val="en-US"/>
+              </w:rPr>
+            </w:pPr>
+            <w:r>
+              <w:rPr>
+                <w:rStyle w:val="BookTitle"/>
+                <w:b w:val="0"/>
+                <w:bCs w:val="0"/>
+                <w:i w:val="0"/>
+                <w:iCs w:val="0"/>
+                <w:lang w:val="en-US"/>
+              </w:rPr>
+              <w:t>Recall</w:t>
+            </w:r>
+          </w:p>
+        </w:tc>
+        <w:tc>
+          <w:tcPr>
+            <w:tcW w:w="1733" w:type="dxa"/>
+          </w:tcPr>
+          <w:p>
+            <w:pPr>
+              <w:pStyle w:val="ListParagraph"/>
+              <w:ind w:left="0"/>
+              <w:rPr>
+                <w:rStyle w:val="BookTitle"/>
+                <w:b w:val="0"/>
+                <w:bCs w:val="0"/>
+                <w:i w:val="0"/>
+                <w:iCs w:val="0"/>
+                <w:lang w:val="en-US"/>
+              </w:rPr>
+            </w:pPr>
+            <w:r>
+              <w:rPr>
+                <w:rStyle w:val="BookTitle"/>
+                <w:b w:val="0"/>
+                <w:bCs w:val="0"/>
+                <w:i w:val="0"/>
+                <w:iCs w:val="0"/>
+                <w:lang w:val="en-US"/>
+              </w:rPr>
+              <w:t>F1 Score</w:t>
+            </w:r>
+          </w:p>
+        </w:tc>
+      </w:tr>
+      <w:tr>
+        <w:tc>
+          <w:tcPr>
+            <w:tcW w:w="1731" w:type="dxa"/>
+          </w:tcPr>
+          <w:p>
+            <w:pPr>
+              <w:pStyle w:val="ListParagraph"/>
+              <w:ind w:left="0"/>
+              <w:rPr>
+                <w:rStyle w:val="BookTitle"/>
+                <w:b w:val="0"/>
+                <w:bCs w:val="0"/>
+                <w:i w:val="0"/>
+                <w:iCs w:val="0"/>
+                <w:color w:val="4472C4" w:themeColor="accent1"/>
+                <w:lang w:val="en-US"/>
+              </w:rPr>
+            </w:pPr>
+            <w:r>
+              <w:rPr>
+                <w:rStyle w:val="BookTitle"/>
+                <w:b w:val="0"/>
+                <w:bCs w:val="0"/>
+                <w:i w:val="0"/>
+                <w:iCs w:val="0"/>
+                <w:color w:val="4472C4" w:themeColor="accent1"/>
+                <w:lang w:val="en-US"/>
+              </w:rPr>
+              <w:t>Logistic Regression</w:t>
+            </w:r>
+          </w:p>
+        </w:tc>
+        <w:tc>
+          <w:tcPr>
+            <w:tcW w:w="1731" w:type="dxa"/>
+          </w:tcPr>
+          <w:p>
+            <w:pPr>
+              <w:pStyle w:val="ListParagraph"/>
+              <w:ind w:left="0"/>
+              <w:rPr>
+                <w:rStyle w:val="BookTitle"/>
+                <w:b w:val="0"/>
+                <w:bCs w:val="0"/>
+                <w:i w:val="0"/>
+                <w:iCs w:val="0"/>
+                <w:color w:val="4472C4" w:themeColor="accent1"/>
+                <w:lang w:val="en-US"/>
+              </w:rPr>
+            </w:pPr>
+            <w:r>
+              <w:rPr>
+                <w:rStyle w:val="BookTitle"/>
+                <w:b w:val="0"/>
+                <w:bCs w:val="0"/>
+                <w:i w:val="0"/>
+                <w:iCs w:val="0"/>
+                <w:color w:val="4472C4" w:themeColor="accent1"/>
+                <w:lang w:val="en-US"/>
+              </w:rPr>
+              <w:t>85%</w:t>
+            </w:r>
+          </w:p>
+        </w:tc>
+        <w:tc>
+          <w:tcPr>
+            <w:tcW w:w="1732" w:type="dxa"/>
+          </w:tcPr>
+          <w:p>
+            <w:pPr>
+              <w:pStyle w:val="ListParagraph"/>
+              <w:ind w:left="0"/>
+              <w:rPr>
+                <w:rStyle w:val="BookTitle"/>
+                <w:b w:val="0"/>
+                <w:bCs w:val="0"/>
+                <w:i w:val="0"/>
+                <w:iCs w:val="0"/>
+                <w:color w:val="4472C4" w:themeColor="accent1"/>
+                <w:lang w:val="en-US"/>
+              </w:rPr>
+            </w:pPr>
+            <w:r>
+              <w:rPr>
+                <w:rStyle w:val="BookTitle"/>
+                <w:b w:val="0"/>
+                <w:bCs w:val="0"/>
+                <w:i w:val="0"/>
+                <w:iCs w:val="0"/>
+                <w:color w:val="4472C4" w:themeColor="accent1"/>
+                <w:lang w:val="en-US"/>
+              </w:rPr>
+              <w:t>86%</w:t>
+            </w:r>
+          </w:p>
+        </w:tc>
+        <w:tc>
+          <w:tcPr>
+            <w:tcW w:w="1732" w:type="dxa"/>
+          </w:tcPr>
+          <w:p>
+            <w:pPr>
+              <w:pStyle w:val="ListParagraph"/>
+              <w:ind w:left="0"/>
+              <w:rPr>
+                <w:rStyle w:val="BookTitle"/>
+                <w:b w:val="0"/>
+                <w:bCs w:val="0"/>
+                <w:i w:val="0"/>
+                <w:iCs w:val="0"/>
+                <w:color w:val="4472C4" w:themeColor="accent1"/>
+                <w:lang w:val="en-US"/>
+              </w:rPr>
+            </w:pPr>
+            <w:r>
+              <w:rPr>
+                <w:rStyle w:val="BookTitle"/>
+                <w:b w:val="0"/>
+                <w:bCs w:val="0"/>
+                <w:i w:val="0"/>
+                <w:iCs w:val="0"/>
+                <w:color w:val="4472C4" w:themeColor="accent1"/>
+                <w:lang w:val="en-US"/>
+              </w:rPr>
+              <w:t>85%</w:t>
+            </w:r>
+          </w:p>
+        </w:tc>
+        <w:tc>
+          <w:tcPr>
+            <w:tcW w:w="1733" w:type="dxa"/>
+          </w:tcPr>
+          <w:p>
+            <w:pPr>
+              <w:pStyle w:val="ListParagraph"/>
+              <w:ind w:left="0"/>
+              <w:rPr>
+                <w:rStyle w:val="BookTitle"/>
+                <w:b w:val="0"/>
+                <w:bCs w:val="0"/>
+                <w:i w:val="0"/>
+                <w:iCs w:val="0"/>
+                <w:color w:val="4472C4" w:themeColor="accent1"/>
+                <w:lang w:val="en-US"/>
+              </w:rPr>
+            </w:pPr>
+            <w:r>
+              <w:rPr>
+                <w:rStyle w:val="BookTitle"/>
+                <w:b w:val="0"/>
+                <w:bCs w:val="0"/>
+                <w:i w:val="0"/>
+                <w:iCs w:val="0"/>
+                <w:color w:val="4472C4" w:themeColor="accent1"/>
+                <w:lang w:val="en-US"/>
+              </w:rPr>
+              <w:t>85%</w:t>
+            </w:r>
+          </w:p>
+        </w:tc>
+      </w:tr>
+      <w:tr>
+        <w:tc>
+          <w:tcPr>
+            <w:tcW w:w="1731" w:type="dxa"/>
+          </w:tcPr>
+          <w:p>
+            <w:pPr>
+              <w:pStyle w:val="ListParagraph"/>
+              <w:ind w:left="0"/>
+              <w:rPr>
+                <w:rStyle w:val="BookTitle"/>
+                <w:b w:val="0"/>
+                <w:bCs w:val="0"/>
+                <w:i w:val="0"/>
+                <w:iCs w:val="0"/>
+                <w:lang w:val="en-US"/>
+              </w:rPr>
+            </w:pPr>
+            <w:r>
+              <w:rPr>
+                <w:rStyle w:val="BookTitle"/>
+                <w:b w:val="0"/>
+                <w:bCs w:val="0"/>
+                <w:i w:val="0"/>
+                <w:iCs w:val="0"/>
+                <w:lang w:val="en-US"/>
+              </w:rPr>
+              <w:t>Multinomial Naïve Bayes</w:t>
+            </w:r>
+          </w:p>
+        </w:tc>
+        <w:tc>
+          <w:tcPr>
+            <w:tcW w:w="1731" w:type="dxa"/>
+          </w:tcPr>
+          <w:p>
+            <w:pPr>
+              <w:pStyle w:val="ListParagraph"/>
+              <w:ind w:left="0"/>
+              <w:rPr>
+                <w:rStyle w:val="BookTitle"/>
+                <w:b w:val="0"/>
+                <w:bCs w:val="0"/>
+                <w:i w:val="0"/>
+                <w:iCs w:val="0"/>
+                <w:lang w:val="en-US"/>
+              </w:rPr>
+            </w:pPr>
+            <w:r>
+              <w:rPr>
+                <w:rStyle w:val="BookTitle"/>
+                <w:b w:val="0"/>
+                <w:bCs w:val="0"/>
+                <w:i w:val="0"/>
+                <w:iCs w:val="0"/>
+                <w:lang w:val="en-US"/>
+              </w:rPr>
+              <w:t>73%</w:t>
+            </w:r>
+          </w:p>
+        </w:tc>
+        <w:tc>
+          <w:tcPr>
+            <w:tcW w:w="1732" w:type="dxa"/>
+          </w:tcPr>
+          <w:p>
+            <w:pPr>
+              <w:pStyle w:val="ListParagraph"/>
+              <w:ind w:left="0"/>
+              <w:rPr>
+                <w:rStyle w:val="BookTitle"/>
+                <w:b w:val="0"/>
+                <w:bCs w:val="0"/>
+                <w:i w:val="0"/>
+                <w:iCs w:val="0"/>
+                <w:lang w:val="en-US"/>
+              </w:rPr>
+            </w:pPr>
+            <w:r>
+              <w:rPr>
+                <w:rStyle w:val="BookTitle"/>
+                <w:b w:val="0"/>
+                <w:bCs w:val="0"/>
+                <w:i w:val="0"/>
+                <w:iCs w:val="0"/>
+                <w:lang w:val="en-US"/>
+              </w:rPr>
+              <w:t>78%</w:t>
+            </w:r>
+          </w:p>
+        </w:tc>
+        <w:tc>
+          <w:tcPr>
+            <w:tcW w:w="1732" w:type="dxa"/>
+          </w:tcPr>
+          <w:p>
+            <w:pPr>
+              <w:pStyle w:val="ListParagraph"/>
+              <w:ind w:left="0"/>
+              <w:rPr>
+                <w:rStyle w:val="BookTitle"/>
+                <w:b w:val="0"/>
+                <w:bCs w:val="0"/>
+                <w:i w:val="0"/>
+                <w:iCs w:val="0"/>
+                <w:lang w:val="en-US"/>
+              </w:rPr>
+            </w:pPr>
+            <w:r>
+              <w:rPr>
+                <w:rStyle w:val="BookTitle"/>
+                <w:b w:val="0"/>
+                <w:bCs w:val="0"/>
+                <w:i w:val="0"/>
+                <w:iCs w:val="0"/>
+                <w:lang w:val="en-US"/>
+              </w:rPr>
+              <w:t>73%</w:t>
+            </w:r>
+          </w:p>
+        </w:tc>
+        <w:tc>
+          <w:tcPr>
+            <w:tcW w:w="1733" w:type="dxa"/>
+          </w:tcPr>
+          <w:p>
+            <w:pPr>
+              <w:pStyle w:val="ListParagraph"/>
+              <w:ind w:left="0"/>
+              <w:rPr>
+                <w:rStyle w:val="BookTitle"/>
+                <w:b w:val="0"/>
+                <w:bCs w:val="0"/>
+                <w:i w:val="0"/>
+                <w:iCs w:val="0"/>
+                <w:lang w:val="en-US"/>
+              </w:rPr>
+            </w:pPr>
+            <w:r>
+              <w:rPr>
+                <w:rStyle w:val="BookTitle"/>
+                <w:b w:val="0"/>
+                <w:bCs w:val="0"/>
+                <w:i w:val="0"/>
+                <w:iCs w:val="0"/>
+                <w:lang w:val="en-US"/>
+              </w:rPr>
+              <w:t>72%</w:t>
+            </w:r>
+          </w:p>
+        </w:tc>
+      </w:tr>
+      <w:tr>
+        <w:tc>
+          <w:tcPr>
+            <w:tcW w:w="1731" w:type="dxa"/>
+          </w:tcPr>
+          <w:p>
+            <w:pPr>
+              <w:pStyle w:val="ListParagraph"/>
+              <w:ind w:left="0"/>
+              <w:rPr>
+                <w:rStyle w:val="BookTitle"/>
+                <w:b w:val="0"/>
+                <w:bCs w:val="0"/>
+                <w:i w:val="0"/>
+                <w:iCs w:val="0"/>
+                <w:lang w:val="en-US"/>
+              </w:rPr>
+            </w:pPr>
+            <w:r>
+              <w:rPr>
+                <w:rStyle w:val="BookTitle"/>
+                <w:b w:val="0"/>
+                <w:bCs w:val="0"/>
+                <w:i w:val="0"/>
+                <w:iCs w:val="0"/>
+                <w:lang w:val="en-US"/>
+              </w:rPr>
+              <w:t>Linear SVM</w:t>
+            </w:r>
+          </w:p>
+        </w:tc>
+        <w:tc>
+          <w:tcPr>
+            <w:tcW w:w="1731" w:type="dxa"/>
+          </w:tcPr>
+          <w:p>
+            <w:pPr>
+              <w:pStyle w:val="ListParagraph"/>
+              <w:ind w:left="0"/>
+              <w:rPr>
+                <w:rStyle w:val="BookTitle"/>
+                <w:b w:val="0"/>
+                <w:bCs w:val="0"/>
+                <w:i w:val="0"/>
+                <w:iCs w:val="0"/>
+                <w:lang w:val="en-US"/>
+              </w:rPr>
+            </w:pPr>
+            <w:r>
+              <w:rPr>
+                <w:rStyle w:val="BookTitle"/>
+                <w:b w:val="0"/>
+                <w:bCs w:val="0"/>
+                <w:i w:val="0"/>
+                <w:iCs w:val="0"/>
+                <w:lang w:val="en-US"/>
+              </w:rPr>
+              <w:t>85%</w:t>
+            </w:r>
+          </w:p>
+        </w:tc>
+        <w:tc>
+          <w:tcPr>
+            <w:tcW w:w="1732" w:type="dxa"/>
+          </w:tcPr>
+          <w:p>
+            <w:pPr>
+              <w:pStyle w:val="ListParagraph"/>
+              <w:ind w:left="0"/>
+              <w:rPr>
+                <w:rStyle w:val="BookTitle"/>
+                <w:b w:val="0"/>
+                <w:bCs w:val="0"/>
+                <w:i w:val="0"/>
+                <w:iCs w:val="0"/>
+                <w:lang w:val="en-US"/>
+              </w:rPr>
+            </w:pPr>
+            <w:r>
+              <w:rPr>
+                <w:rStyle w:val="BookTitle"/>
+                <w:b w:val="0"/>
+                <w:bCs w:val="0"/>
+                <w:i w:val="0"/>
+                <w:iCs w:val="0"/>
+                <w:lang w:val="en-US"/>
+              </w:rPr>
+              <w:t>85%</w:t>
+            </w:r>
+          </w:p>
+        </w:tc>
+        <w:tc>
+          <w:tcPr>
+            <w:tcW w:w="1732" w:type="dxa"/>
+          </w:tcPr>
+          <w:p>
+            <w:pPr>
+              <w:pStyle w:val="ListParagraph"/>
+              <w:ind w:left="0"/>
+              <w:rPr>
+                <w:rStyle w:val="BookTitle"/>
+                <w:b w:val="0"/>
+                <w:bCs w:val="0"/>
+                <w:i w:val="0"/>
+                <w:iCs w:val="0"/>
+                <w:lang w:val="en-US"/>
+              </w:rPr>
+            </w:pPr>
+            <w:r>
+              <w:rPr>
+                <w:rStyle w:val="BookTitle"/>
+                <w:b w:val="0"/>
+                <w:bCs w:val="0"/>
+                <w:i w:val="0"/>
+                <w:iCs w:val="0"/>
+                <w:lang w:val="en-US"/>
+              </w:rPr>
+              <w:t>85%</w:t>
+            </w:r>
+          </w:p>
+        </w:tc>
+        <w:tc>
+          <w:tcPr>
+            <w:tcW w:w="1733" w:type="dxa"/>
+          </w:tcPr>
+          <w:p>
+            <w:pPr>
+              <w:pStyle w:val="ListParagraph"/>
+              <w:ind w:left="0"/>
+              <w:rPr>
+                <w:rStyle w:val="BookTitle"/>
+                <w:b w:val="0"/>
+                <w:bCs w:val="0"/>
+                <w:i w:val="0"/>
+                <w:iCs w:val="0"/>
+                <w:lang w:val="en-US"/>
+              </w:rPr>
+            </w:pPr>
+            <w:r>
+              <w:rPr>
+                <w:rStyle w:val="BookTitle"/>
+                <w:b w:val="0"/>
+                <w:bCs w:val="0"/>
+                <w:i w:val="0"/>
+                <w:iCs w:val="0"/>
+                <w:lang w:val="en-US"/>
+              </w:rPr>
+              <w:t>85%</w:t>
+            </w:r>
+          </w:p>
+        </w:tc>
+      </w:tr>
+      <w:tr>
+        <w:tc>
+          <w:tcPr>
+            <w:tcW w:w="1731" w:type="dxa"/>
+          </w:tcPr>
+          <w:p>
+            <w:pPr>
+              <w:pStyle w:val="ListParagraph"/>
+              <w:ind w:left="0"/>
+              <w:rPr>
+                <w:rStyle w:val="BookTitle"/>
+                <w:b w:val="0"/>
+                <w:bCs w:val="0"/>
+                <w:i w:val="0"/>
+                <w:iCs w:val="0"/>
+                <w:lang w:val="en-US"/>
+              </w:rPr>
+            </w:pPr>
+            <w:r>
+              <w:rPr>
+                <w:rStyle w:val="BookTitle"/>
+                <w:b w:val="0"/>
+                <w:bCs w:val="0"/>
+                <w:i w:val="0"/>
+                <w:iCs w:val="0"/>
+                <w:lang w:val="en-US"/>
+              </w:rPr>
+              <w:t>Random Forest</w:t>
+            </w:r>
+          </w:p>
+        </w:tc>
+        <w:tc>
+          <w:tcPr>
+            <w:tcW w:w="1731" w:type="dxa"/>
+          </w:tcPr>
+          <w:p>
+            <w:pPr>
+              <w:pStyle w:val="ListParagraph"/>
+              <w:ind w:left="0"/>
+              <w:rPr>
+                <w:rStyle w:val="BookTitle"/>
+                <w:b w:val="0"/>
+                <w:bCs w:val="0"/>
+                <w:i w:val="0"/>
+                <w:iCs w:val="0"/>
+                <w:lang w:val="en-US"/>
+              </w:rPr>
+            </w:pPr>
+            <w:r>
+              <w:rPr>
+                <w:rStyle w:val="BookTitle"/>
+                <w:b w:val="0"/>
+                <w:bCs w:val="0"/>
+                <w:i w:val="0"/>
+                <w:iCs w:val="0"/>
+                <w:lang w:val="en-US"/>
+              </w:rPr>
+              <w:t>83%</w:t>
+            </w:r>
+          </w:p>
+        </w:tc>
+        <w:tc>
+          <w:tcPr>
+            <w:tcW w:w="1732" w:type="dxa"/>
+          </w:tcPr>
+          <w:p>
+            <w:pPr>
+              <w:pStyle w:val="ListParagraph"/>
+              <w:ind w:left="0"/>
+              <w:rPr>
+                <w:rStyle w:val="BookTitle"/>
+                <w:b w:val="0"/>
+                <w:bCs w:val="0"/>
+                <w:i w:val="0"/>
+                <w:iCs w:val="0"/>
+                <w:lang w:val="en-US"/>
+              </w:rPr>
+            </w:pPr>
+            <w:r>
+              <w:rPr>
+                <w:rStyle w:val="BookTitle"/>
+                <w:b w:val="0"/>
+                <w:bCs w:val="0"/>
+                <w:i w:val="0"/>
+                <w:iCs w:val="0"/>
+                <w:lang w:val="en-US"/>
+              </w:rPr>
+              <w:t>84%</w:t>
+            </w:r>
+          </w:p>
+        </w:tc>
+        <w:tc>
+          <w:tcPr>
+            <w:tcW w:w="1732" w:type="dxa"/>
+          </w:tcPr>
+          <w:p>
+            <w:pPr>
+              <w:pStyle w:val="ListParagraph"/>
+              <w:ind w:left="0"/>
+              <w:rPr>
+                <w:rStyle w:val="BookTitle"/>
+                <w:b w:val="0"/>
+                <w:bCs w:val="0"/>
+                <w:i w:val="0"/>
+                <w:iCs w:val="0"/>
+                <w:lang w:val="en-US"/>
+              </w:rPr>
+            </w:pPr>
+            <w:r>
+              <w:rPr>
+                <w:rStyle w:val="BookTitle"/>
+                <w:b w:val="0"/>
+                <w:bCs w:val="0"/>
+                <w:i w:val="0"/>
+                <w:iCs w:val="0"/>
+                <w:lang w:val="en-US"/>
+              </w:rPr>
+              <w:t>83%</w:t>
+            </w:r>
+          </w:p>
+        </w:tc>
+        <w:tc>
+          <w:tcPr>
+            <w:tcW w:w="1733" w:type="dxa"/>
+          </w:tcPr>
+          <w:p>
+            <w:pPr>
+              <w:pStyle w:val="ListParagraph"/>
+              <w:ind w:left="0"/>
+              <w:rPr>
+                <w:rStyle w:val="BookTitle"/>
+                <w:b w:val="0"/>
+                <w:bCs w:val="0"/>
+                <w:i w:val="0"/>
+                <w:iCs w:val="0"/>
+                <w:lang w:val="en-US"/>
+              </w:rPr>
+            </w:pPr>
+            <w:r>
+              <w:rPr>
+                <w:rStyle w:val="BookTitle"/>
+                <w:b w:val="0"/>
+                <w:bCs w:val="0"/>
+                <w:i w:val="0"/>
+                <w:iCs w:val="0"/>
+                <w:lang w:val="en-US"/>
+              </w:rPr>
+              <w:t>83%</w:t>
+            </w:r>
+          </w:p>
+        </w:tc>
+      </w:tr>
+    </w:tbl>
+    <w:p>
+      <w:pPr>
+        <w:pStyle w:val="ListParagraph"/>
+        <w:spacing w:after="0"/>
+        <w:ind w:left="357"/>
+        <w:rPr>
+          <w:rStyle w:val="BookTitle"/>
+          <w:b w:val="0"/>
+          <w:bCs w:val="0"/>
+          <w:i w:val="0"/>
+          <w:iCs w:val="0"/>
+          <w:lang w:val="en-US"/>
+        </w:rPr>
+      </w:pPr>
+    </w:p>
+    <w:p>
+      <w:pPr>
+        <w:spacing w:after="0"/>
+        <w:ind w:left="360"/>
+        <w:rPr>
+          <w:rStyle w:val="BookTitle"/>
+          <w:i w:val="0"/>
+          <w:iCs w:val="0"/>
+          <w:sz w:val="28"/>
+          <w:szCs w:val="28"/>
+          <w:lang w:val="en-US"/>
+        </w:rPr>
+      </w:pPr>
     </w:p>
     <w:p>
       <w:pPr>
@@ -3506,7 +4765,7 @@
   <w:abstractNum w:abstractNumId="0" w15:restartNumberingAfterBreak="0">
     <w:nsid w:val="1E782591"/>
     <w:multiLevelType w:val="hybridMultilevel"/>
-    <w:tmpl w:val="BB38F73E"/>
+    <w:tmpl w:val="8F344BF2"/>
     <w:lvl w:ilvl="0" w:tplc="4009000F">
       <w:start w:val="1"/>
       <w:numFmt w:val="decimal"/>

</xml_diff>